<commit_message>
Documenta el fallo de codificacion y los requisitos de Atlas
El documento tenia tres hallazgos; este es el cuarto y el mas util,
porque es el unico que no se podia encontrar leyendo el codigo ni
corriendo las pruebas: dependia de la consola de quien ejecutara.

Tambien se documenta lo que hace falta del lado de Atlas, sobre todo
la entrada 0.0.0.0/0 en Network Access. Sin ella el proyecto falla en
cualquier maquina que no sea la del autor, y el error que aparece
(ServerSelectionTimeoutError) no apunta hacia la lista de IPs.

Co-Authored-By: Claude Opus 5 <noreply@anthropic.com>
</commit_message>
<xml_diff>
--- a/docs/Proyecto Programacion IV - Gestor de Cobranza.docx
+++ b/docs/Proyecto Programacion IV - Gestor de Cobranza.docx
@@ -112,7 +112,7 @@
           <w:sz w:val="20"/>
           <w:szCs w:val="20"/>
         </w:rPr>
-        <w:t xml:space="preserve">7 de octubre de 2026</w:t>
+        <w:t xml:space="preserve">13 de octubre de 2026</w:t>
       </w:r>
     </w:p>
     <w:p>
@@ -2938,6 +2938,116 @@
     </w:p>
     <w:p>
       <w:pPr>
+        <w:pStyle w:val="Heading2"/>
+        <w:spacing w:after="130" w:before="260"/>
+      </w:pPr>
+      <w:r>
+        <w:rPr>
+          <w:b/>
+          <w:bCs/>
+          <w:color w:val="2F5496"/>
+          <w:sz w:val="25"/>
+          <w:szCs w:val="25"/>
+        </w:rPr>
+        <w:t xml:space="preserve">El error que ninguna prueba podía encontrar</w:t>
+      </w:r>
+    </w:p>
+    <w:p>
+      <w:pPr>
+        <w:spacing w:after="140" w:line="276"/>
+      </w:pPr>
+      <w:r>
+        <w:rPr>
+          <w:sz w:val="22"/>
+          <w:szCs w:val="22"/>
+        </w:rPr>
+        <w:t xml:space="preserve">Con las 21 pruebas en verde levanté el servidor en una consola normal de Windows y no arrancó. No alcanzó a atender una sola petición:</w:t>
+      </w:r>
+    </w:p>
+    <w:p>
+      <w:pPr>
+        <w:shd w:fill="F2F2F2" w:val="clear"/>
+        <w:spacing w:after="0" w:line="240"/>
+        <w:ind w:left="280"/>
+      </w:pPr>
+      <w:r>
+        <w:rPr>
+          <w:rFonts w:ascii="Consolas" w:cs="Consolas" w:eastAsia="Consolas" w:hAnsi="Consolas"/>
+          <w:sz w:val="18"/>
+          <w:szCs w:val="18"/>
+        </w:rPr>
+        <w:t xml:space="preserve">UnicodeEncodeError: 'charmap' codec can't encode character '✓'</w:t>
+      </w:r>
+    </w:p>
+    <w:p>
+      <w:pPr>
+        <w:shd w:fill="F2F2F2" w:val="clear"/>
+        <w:spacing w:after="160" w:line="240"/>
+        <w:ind w:left="280"/>
+      </w:pPr>
+      <w:r>
+        <w:rPr>
+          <w:rFonts w:ascii="Consolas" w:cs="Consolas" w:eastAsia="Consolas" w:hAnsi="Consolas"/>
+          <w:sz w:val="18"/>
+          <w:szCs w:val="18"/>
+        </w:rPr>
+        <w:t xml:space="preserve">ERROR:    Application startup failed. Exiting.</w:t>
+      </w:r>
+    </w:p>
+    <w:p>
+      <w:pPr>
+        <w:spacing w:after="140" w:line="276"/>
+      </w:pPr>
+      <w:r>
+        <w:rPr>
+          <w:sz w:val="22"/>
+          <w:szCs w:val="22"/>
+        </w:rPr>
+        <w:t xml:space="preserve">El mensaje de bienvenida llevaba una palomita «✓». La consola de Windows no usa UTF-8 sino cp1252, que no tiene ese carácter; el print lanzaba la excepción dentro del lifespan y la aplicación moría durante el arranque, antes de abrir el puerto.</w:t>
+      </w:r>
+    </w:p>
+    <w:p>
+      <w:pPr>
+        <w:spacing w:after="140" w:line="276"/>
+      </w:pPr>
+      <w:r>
+        <w:rPr>
+          <w:sz w:val="22"/>
+          <w:szCs w:val="22"/>
+        </w:rPr>
+        <w:t xml:space="preserve">Lo interesante no es el error sino por qué tardó tanto en salir: yo lo probaba desde una terminal configurada en UTF-8, y esa terminal </w:t>
+      </w:r>
+      <w:r>
+        <w:rPr>
+          <w:b/>
+          <w:bCs/>
+          <w:sz w:val="22"/>
+          <w:szCs w:val="22"/>
+        </w:rPr>
+        <w:t xml:space="preserve">escondía el problema</w:t>
+      </w:r>
+      <w:r>
+        <w:rPr>
+          <w:sz w:val="22"/>
+          <w:szCs w:val="22"/>
+        </w:rPr>
+        <w:t xml:space="preserve">. Las pruebas tampoco podían verlo, porque capturan la salida en vez de escribirla en una consola real. Era un fallo que solo existía en la computadora de alguien más.</w:t>
+      </w:r>
+    </w:p>
+    <w:p>
+      <w:pPr>
+        <w:spacing w:after="140" w:line="276"/>
+      </w:pPr>
+      <w:r>
+        <w:rPr>
+          <w:sz w:val="22"/>
+          <w:szCs w:val="22"/>
+        </w:rPr>
+        <w:t xml:space="preserve">Lo corregí en dos capas. Los mensajes de arranque y cierre quedaron en ASCII puro; y sys.stdout se reconfigura con errors="replace" al importar la aplicación, de modo que ningún print futuro pueda repetir el accidente. La segunda capa importa más que la primera: un saludo en consola no debería tener la capacidad de impedir que arranque el servidor.</w:t>
+      </w:r>
+    </w:p>
+    <w:p>
+      <w:pPr>
         <w:pStyle w:val="Heading1"/>
         <w:spacing w:after="180" w:before="360"/>
       </w:pPr>
@@ -2954,198 +3064,6 @@
     </w:p>
     <w:p>
       <w:pPr>
-        <w:shd w:fill="F2F2F2" w:val="clear"/>
-        <w:spacing w:after="0" w:line="240"/>
-        <w:ind w:left="280"/>
-      </w:pPr>
-      <w:r>
-        <w:rPr>
-          <w:rFonts w:ascii="Consolas" w:cs="Consolas" w:eastAsia="Consolas" w:hAnsi="Consolas"/>
-          <w:sz w:val="18"/>
-          <w:szCs w:val="18"/>
-        </w:rPr>
-        <w:t xml:space="preserve"># 1. Instalar dependencias</w:t>
-      </w:r>
-    </w:p>
-    <w:p>
-      <w:pPr>
-        <w:shd w:fill="F2F2F2" w:val="clear"/>
-        <w:spacing w:after="0" w:line="240"/>
-        <w:ind w:left="280"/>
-      </w:pPr>
-      <w:r>
-        <w:rPr>
-          <w:rFonts w:ascii="Consolas" w:cs="Consolas" w:eastAsia="Consolas" w:hAnsi="Consolas"/>
-          <w:sz w:val="18"/>
-          <w:szCs w:val="18"/>
-        </w:rPr>
-        <w:t xml:space="preserve">pip install -r requirements.txt</w:t>
-      </w:r>
-    </w:p>
-    <w:p>
-      <w:pPr>
-        <w:shd w:fill="F2F2F2" w:val="clear"/>
-        <w:spacing w:after="0" w:line="240"/>
-        <w:ind w:left="280"/>
-      </w:pPr>
-      <w:r>
-        <w:rPr>
-          <w:rFonts w:ascii="Consolas" w:cs="Consolas" w:eastAsia="Consolas" w:hAnsi="Consolas"/>
-          <w:sz w:val="18"/>
-          <w:szCs w:val="18"/>
-        </w:rPr>
-        <w:t xml:space="preserve"> </w:t>
-      </w:r>
-    </w:p>
-    <w:p>
-      <w:pPr>
-        <w:shd w:fill="F2F2F2" w:val="clear"/>
-        <w:spacing w:after="0" w:line="240"/>
-        <w:ind w:left="280"/>
-      </w:pPr>
-      <w:r>
-        <w:rPr>
-          <w:rFonts w:ascii="Consolas" w:cs="Consolas" w:eastAsia="Consolas" w:hAnsi="Consolas"/>
-          <w:sz w:val="18"/>
-          <w:szCs w:val="18"/>
-        </w:rPr>
-        <w:t xml:space="preserve"># 2. Configurar la base de datos</w:t>
-      </w:r>
-    </w:p>
-    <w:p>
-      <w:pPr>
-        <w:shd w:fill="F2F2F2" w:val="clear"/>
-        <w:spacing w:after="0" w:line="240"/>
-        <w:ind w:left="280"/>
-      </w:pPr>
-      <w:r>
-        <w:rPr>
-          <w:rFonts w:ascii="Consolas" w:cs="Consolas" w:eastAsia="Consolas" w:hAnsi="Consolas"/>
-          <w:sz w:val="18"/>
-          <w:szCs w:val="18"/>
-        </w:rPr>
-        <w:t xml:space="preserve">copy .env.example .env</w:t>
-      </w:r>
-    </w:p>
-    <w:p>
-      <w:pPr>
-        <w:shd w:fill="F2F2F2" w:val="clear"/>
-        <w:spacing w:after="0" w:line="240"/>
-        <w:ind w:left="280"/>
-      </w:pPr>
-      <w:r>
-        <w:rPr>
-          <w:rFonts w:ascii="Consolas" w:cs="Consolas" w:eastAsia="Consolas" w:hAnsi="Consolas"/>
-          <w:sz w:val="18"/>
-          <w:szCs w:val="18"/>
-        </w:rPr>
-        <w:t xml:space="preserve">#    editar .env y poner la cadena de MongoDB Atlas</w:t>
-      </w:r>
-    </w:p>
-    <w:p>
-      <w:pPr>
-        <w:shd w:fill="F2F2F2" w:val="clear"/>
-        <w:spacing w:after="0" w:line="240"/>
-        <w:ind w:left="280"/>
-      </w:pPr>
-      <w:r>
-        <w:rPr>
-          <w:rFonts w:ascii="Consolas" w:cs="Consolas" w:eastAsia="Consolas" w:hAnsi="Consolas"/>
-          <w:sz w:val="18"/>
-          <w:szCs w:val="18"/>
-        </w:rPr>
-        <w:t xml:space="preserve"> </w:t>
-      </w:r>
-    </w:p>
-    <w:p>
-      <w:pPr>
-        <w:shd w:fill="F2F2F2" w:val="clear"/>
-        <w:spacing w:after="0" w:line="240"/>
-        <w:ind w:left="280"/>
-      </w:pPr>
-      <w:r>
-        <w:rPr>
-          <w:rFonts w:ascii="Consolas" w:cs="Consolas" w:eastAsia="Consolas" w:hAnsi="Consolas"/>
-          <w:sz w:val="18"/>
-          <w:szCs w:val="18"/>
-        </w:rPr>
-        <w:t xml:space="preserve"># 3. Cargar datos de ejemplo (opcional)</w:t>
-      </w:r>
-    </w:p>
-    <w:p>
-      <w:pPr>
-        <w:shd w:fill="F2F2F2" w:val="clear"/>
-        <w:spacing w:after="0" w:line="240"/>
-        <w:ind w:left="280"/>
-      </w:pPr>
-      <w:r>
-        <w:rPr>
-          <w:rFonts w:ascii="Consolas" w:cs="Consolas" w:eastAsia="Consolas" w:hAnsi="Consolas"/>
-          <w:sz w:val="18"/>
-          <w:szCs w:val="18"/>
-        </w:rPr>
-        <w:t xml:space="preserve">py sembrar.py</w:t>
-      </w:r>
-    </w:p>
-    <w:p>
-      <w:pPr>
-        <w:shd w:fill="F2F2F2" w:val="clear"/>
-        <w:spacing w:after="0" w:line="240"/>
-        <w:ind w:left="280"/>
-      </w:pPr>
-      <w:r>
-        <w:rPr>
-          <w:rFonts w:ascii="Consolas" w:cs="Consolas" w:eastAsia="Consolas" w:hAnsi="Consolas"/>
-          <w:sz w:val="18"/>
-          <w:szCs w:val="18"/>
-        </w:rPr>
-        <w:t xml:space="preserve"> </w:t>
-      </w:r>
-    </w:p>
-    <w:p>
-      <w:pPr>
-        <w:shd w:fill="F2F2F2" w:val="clear"/>
-        <w:spacing w:after="0" w:line="240"/>
-        <w:ind w:left="280"/>
-      </w:pPr>
-      <w:r>
-        <w:rPr>
-          <w:rFonts w:ascii="Consolas" w:cs="Consolas" w:eastAsia="Consolas" w:hAnsi="Consolas"/>
-          <w:sz w:val="18"/>
-          <w:szCs w:val="18"/>
-        </w:rPr>
-        <w:t xml:space="preserve"># 4. Levantar el servidor</w:t>
-      </w:r>
-    </w:p>
-    <w:p>
-      <w:pPr>
-        <w:shd w:fill="F2F2F2" w:val="clear"/>
-        <w:spacing w:after="160" w:line="240"/>
-        <w:ind w:left="280"/>
-      </w:pPr>
-      <w:r>
-        <w:rPr>
-          <w:rFonts w:ascii="Consolas" w:cs="Consolas" w:eastAsia="Consolas" w:hAnsi="Consolas"/>
-          <w:sz w:val="18"/>
-          <w:szCs w:val="18"/>
-        </w:rPr>
-        <w:t xml:space="preserve">py -m uvicorn app.main:app --reload</w:t>
-      </w:r>
-    </w:p>
-    <w:p>
-      <w:pPr>
-        <w:spacing w:after="140" w:line="276"/>
-      </w:pPr>
-      <w:r>
-        <w:rPr>
-          <w:sz w:val="22"/>
-          <w:szCs w:val="22"/>
-        </w:rPr>
-        <w:t xml:space="preserve">La aplicación queda en http://localhost:8000 y la documentación interactiva de la API, generada automáticamente por FastAPI, en http://localhost:8000/docs.</w:t>
-      </w:r>
-    </w:p>
-    <w:p>
-      <w:pPr>
         <w:pStyle w:val="Heading2"/>
         <w:spacing w:after="130" w:before="260"/>
       </w:pPr>
@@ -3157,7 +3075,7 @@
           <w:sz w:val="25"/>
           <w:szCs w:val="25"/>
         </w:rPr>
-        <w:t xml:space="preserve">Para comprobar la concurrencia</w:t>
+        <w:t xml:space="preserve">Lo que debe estar listo en MongoDB Atlas</w:t>
       </w:r>
     </w:p>
     <w:p>
@@ -3174,7 +3092,7 @@
           <w:sz w:val="22"/>
           <w:szCs w:val="22"/>
         </w:rPr>
-        <w:t xml:space="preserve">Subir los escenarios a 150,000 o más.</w:t>
+        <w:t xml:space="preserve">Un cluster M0 (el gratuito) y un usuario de base de datos con permiso de lectura y escritura.</w:t>
       </w:r>
     </w:p>
     <w:p>
@@ -3191,7 +3109,7 @@
           <w:sz w:val="22"/>
           <w:szCs w:val="22"/>
         </w:rPr>
-        <w:t xml:space="preserve">Pulsar «Proyectar sin bloquear»: el latido de arriba sigue pulsando en verde y el resultado dice que corrió en un hilo asyncio_N.</w:t>
+        <w:t xml:space="preserve">La cadena de conexión que entrega Atlas en Connect → Drivers → Python, con la contraseña real sustituida en el marcador &lt;db_password&gt;. Esa cadena va en el archivo .env, que no se sube al repositorio.</w:t>
       </w:r>
     </w:p>
     <w:p>
@@ -3208,6 +3126,282 @@
           <w:sz w:val="22"/>
           <w:szCs w:val="22"/>
         </w:rPr>
+        <w:t xml:space="preserve">En Network Access, una entrada 0.0.0.0/0 en estado Active. Atlas bloquea las conexiones por IP de origen, y si solo está autorizada la IP de quien desarrolló el proyecto, al abrirlo desde otra computadora no falla con un mensaje claro: falla con un ServerSelectionTimeoutError que parece un error del programa.</w:t>
+      </w:r>
+    </w:p>
+    <w:p>
+      <w:pPr>
+        <w:pStyle w:val="ListParagraph"/>
+        <w:numPr>
+          <w:ilvl w:val="0"/>
+          <w:numId w:val="2"/>
+        </w:numPr>
+        <w:spacing w:after="90"/>
+      </w:pPr>
+      <w:r>
+        <w:rPr>
+          <w:sz w:val="22"/>
+          <w:szCs w:val="22"/>
+        </w:rPr>
+        <w:t xml:space="preserve">La base cobranza_escuela no hace falta crearla a mano. MongoDB la crea en el primer insert.</w:t>
+      </w:r>
+    </w:p>
+    <w:p>
+      <w:pPr>
+        <w:shd w:fill="F2F2F2" w:val="clear"/>
+        <w:spacing w:after="0" w:line="240"/>
+        <w:ind w:left="280"/>
+      </w:pPr>
+      <w:r>
+        <w:rPr>
+          <w:rFonts w:ascii="Consolas" w:cs="Consolas" w:eastAsia="Consolas" w:hAnsi="Consolas"/>
+          <w:sz w:val="18"/>
+          <w:szCs w:val="18"/>
+        </w:rPr>
+        <w:t xml:space="preserve"># 1. Instalar dependencias</w:t>
+      </w:r>
+    </w:p>
+    <w:p>
+      <w:pPr>
+        <w:shd w:fill="F2F2F2" w:val="clear"/>
+        <w:spacing w:after="0" w:line="240"/>
+        <w:ind w:left="280"/>
+      </w:pPr>
+      <w:r>
+        <w:rPr>
+          <w:rFonts w:ascii="Consolas" w:cs="Consolas" w:eastAsia="Consolas" w:hAnsi="Consolas"/>
+          <w:sz w:val="18"/>
+          <w:szCs w:val="18"/>
+        </w:rPr>
+        <w:t xml:space="preserve">pip install -r requirements.txt</w:t>
+      </w:r>
+    </w:p>
+    <w:p>
+      <w:pPr>
+        <w:shd w:fill="F2F2F2" w:val="clear"/>
+        <w:spacing w:after="0" w:line="240"/>
+        <w:ind w:left="280"/>
+      </w:pPr>
+      <w:r>
+        <w:rPr>
+          <w:rFonts w:ascii="Consolas" w:cs="Consolas" w:eastAsia="Consolas" w:hAnsi="Consolas"/>
+          <w:sz w:val="18"/>
+          <w:szCs w:val="18"/>
+        </w:rPr>
+        <w:t xml:space="preserve"> </w:t>
+      </w:r>
+    </w:p>
+    <w:p>
+      <w:pPr>
+        <w:shd w:fill="F2F2F2" w:val="clear"/>
+        <w:spacing w:after="0" w:line="240"/>
+        <w:ind w:left="280"/>
+      </w:pPr>
+      <w:r>
+        <w:rPr>
+          <w:rFonts w:ascii="Consolas" w:cs="Consolas" w:eastAsia="Consolas" w:hAnsi="Consolas"/>
+          <w:sz w:val="18"/>
+          <w:szCs w:val="18"/>
+        </w:rPr>
+        <w:t xml:space="preserve"># 2. Configurar la base de datos</w:t>
+      </w:r>
+    </w:p>
+    <w:p>
+      <w:pPr>
+        <w:shd w:fill="F2F2F2" w:val="clear"/>
+        <w:spacing w:after="0" w:line="240"/>
+        <w:ind w:left="280"/>
+      </w:pPr>
+      <w:r>
+        <w:rPr>
+          <w:rFonts w:ascii="Consolas" w:cs="Consolas" w:eastAsia="Consolas" w:hAnsi="Consolas"/>
+          <w:sz w:val="18"/>
+          <w:szCs w:val="18"/>
+        </w:rPr>
+        <w:t xml:space="preserve">copy .env.example .env</w:t>
+      </w:r>
+    </w:p>
+    <w:p>
+      <w:pPr>
+        <w:shd w:fill="F2F2F2" w:val="clear"/>
+        <w:spacing w:after="0" w:line="240"/>
+        <w:ind w:left="280"/>
+      </w:pPr>
+      <w:r>
+        <w:rPr>
+          <w:rFonts w:ascii="Consolas" w:cs="Consolas" w:eastAsia="Consolas" w:hAnsi="Consolas"/>
+          <w:sz w:val="18"/>
+          <w:szCs w:val="18"/>
+        </w:rPr>
+        <w:t xml:space="preserve">#    editar .env y poner la cadena de MongoDB Atlas</w:t>
+      </w:r>
+    </w:p>
+    <w:p>
+      <w:pPr>
+        <w:shd w:fill="F2F2F2" w:val="clear"/>
+        <w:spacing w:after="0" w:line="240"/>
+        <w:ind w:left="280"/>
+      </w:pPr>
+      <w:r>
+        <w:rPr>
+          <w:rFonts w:ascii="Consolas" w:cs="Consolas" w:eastAsia="Consolas" w:hAnsi="Consolas"/>
+          <w:sz w:val="18"/>
+          <w:szCs w:val="18"/>
+        </w:rPr>
+        <w:t xml:space="preserve"> </w:t>
+      </w:r>
+    </w:p>
+    <w:p>
+      <w:pPr>
+        <w:shd w:fill="F2F2F2" w:val="clear"/>
+        <w:spacing w:after="0" w:line="240"/>
+        <w:ind w:left="280"/>
+      </w:pPr>
+      <w:r>
+        <w:rPr>
+          <w:rFonts w:ascii="Consolas" w:cs="Consolas" w:eastAsia="Consolas" w:hAnsi="Consolas"/>
+          <w:sz w:val="18"/>
+          <w:szCs w:val="18"/>
+        </w:rPr>
+        <w:t xml:space="preserve"># 3. Cargar datos de ejemplo (opcional)</w:t>
+      </w:r>
+    </w:p>
+    <w:p>
+      <w:pPr>
+        <w:shd w:fill="F2F2F2" w:val="clear"/>
+        <w:spacing w:after="0" w:line="240"/>
+        <w:ind w:left="280"/>
+      </w:pPr>
+      <w:r>
+        <w:rPr>
+          <w:rFonts w:ascii="Consolas" w:cs="Consolas" w:eastAsia="Consolas" w:hAnsi="Consolas"/>
+          <w:sz w:val="18"/>
+          <w:szCs w:val="18"/>
+        </w:rPr>
+        <w:t xml:space="preserve">py sembrar.py</w:t>
+      </w:r>
+    </w:p>
+    <w:p>
+      <w:pPr>
+        <w:shd w:fill="F2F2F2" w:val="clear"/>
+        <w:spacing w:after="0" w:line="240"/>
+        <w:ind w:left="280"/>
+      </w:pPr>
+      <w:r>
+        <w:rPr>
+          <w:rFonts w:ascii="Consolas" w:cs="Consolas" w:eastAsia="Consolas" w:hAnsi="Consolas"/>
+          <w:sz w:val="18"/>
+          <w:szCs w:val="18"/>
+        </w:rPr>
+        <w:t xml:space="preserve"> </w:t>
+      </w:r>
+    </w:p>
+    <w:p>
+      <w:pPr>
+        <w:shd w:fill="F2F2F2" w:val="clear"/>
+        <w:spacing w:after="0" w:line="240"/>
+        <w:ind w:left="280"/>
+      </w:pPr>
+      <w:r>
+        <w:rPr>
+          <w:rFonts w:ascii="Consolas" w:cs="Consolas" w:eastAsia="Consolas" w:hAnsi="Consolas"/>
+          <w:sz w:val="18"/>
+          <w:szCs w:val="18"/>
+        </w:rPr>
+        <w:t xml:space="preserve"># 4. Levantar el servidor</w:t>
+      </w:r>
+    </w:p>
+    <w:p>
+      <w:pPr>
+        <w:shd w:fill="F2F2F2" w:val="clear"/>
+        <w:spacing w:after="160" w:line="240"/>
+        <w:ind w:left="280"/>
+      </w:pPr>
+      <w:r>
+        <w:rPr>
+          <w:rFonts w:ascii="Consolas" w:cs="Consolas" w:eastAsia="Consolas" w:hAnsi="Consolas"/>
+          <w:sz w:val="18"/>
+          <w:szCs w:val="18"/>
+        </w:rPr>
+        <w:t xml:space="preserve">py -m uvicorn app.main:app --reload</w:t>
+      </w:r>
+    </w:p>
+    <w:p>
+      <w:pPr>
+        <w:spacing w:after="140" w:line="276"/>
+      </w:pPr>
+      <w:r>
+        <w:rPr>
+          <w:sz w:val="22"/>
+          <w:szCs w:val="22"/>
+        </w:rPr>
+        <w:t xml:space="preserve">La aplicación queda en http://localhost:8000 y la documentación interactiva de la API, generada automáticamente por FastAPI, en http://localhost:8000/docs.</w:t>
+      </w:r>
+    </w:p>
+    <w:p>
+      <w:pPr>
+        <w:pStyle w:val="Heading2"/>
+        <w:spacing w:after="130" w:before="260"/>
+      </w:pPr>
+      <w:r>
+        <w:rPr>
+          <w:b/>
+          <w:bCs/>
+          <w:color w:val="2F5496"/>
+          <w:sz w:val="25"/>
+          <w:szCs w:val="25"/>
+        </w:rPr>
+        <w:t xml:space="preserve">Para comprobar la concurrencia</w:t>
+      </w:r>
+    </w:p>
+    <w:p>
+      <w:pPr>
+        <w:pStyle w:val="ListParagraph"/>
+        <w:numPr>
+          <w:ilvl w:val="0"/>
+          <w:numId w:val="2"/>
+        </w:numPr>
+        <w:spacing w:after="90"/>
+      </w:pPr>
+      <w:r>
+        <w:rPr>
+          <w:sz w:val="22"/>
+          <w:szCs w:val="22"/>
+        </w:rPr>
+        <w:t xml:space="preserve">Subir los escenarios a 150,000 o más.</w:t>
+      </w:r>
+    </w:p>
+    <w:p>
+      <w:pPr>
+        <w:pStyle w:val="ListParagraph"/>
+        <w:numPr>
+          <w:ilvl w:val="0"/>
+          <w:numId w:val="2"/>
+        </w:numPr>
+        <w:spacing w:after="90"/>
+      </w:pPr>
+      <w:r>
+        <w:rPr>
+          <w:sz w:val="22"/>
+          <w:szCs w:val="22"/>
+        </w:rPr>
+        <w:t xml:space="preserve">Pulsar «Proyectar sin bloquear»: el latido de arriba sigue pulsando en verde y el resultado dice que corrió en un hilo asyncio_N.</w:t>
+      </w:r>
+    </w:p>
+    <w:p>
+      <w:pPr>
+        <w:pStyle w:val="ListParagraph"/>
+        <w:numPr>
+          <w:ilvl w:val="0"/>
+          <w:numId w:val="2"/>
+        </w:numPr>
+        <w:spacing w:after="90"/>
+      </w:pPr>
+      <w:r>
+        <w:rPr>
+          <w:sz w:val="22"/>
+          <w:szCs w:val="22"/>
+        </w:rPr>
         <w:t xml:space="preserve">Pulsar «Proyectar bloqueando»: el latido se pone rojo y marca los segundos que lleva sin responder, hasta que el cálculo termina.</w:t>
       </w:r>
     </w:p>
@@ -3236,7 +3430,19 @@
           <w:sz w:val="22"/>
           <w:szCs w:val="22"/>
         </w:rPr>
-        <w:t xml:space="preserve">Lo que más me costó de este proyecto no fue escribir el código sino comprobar que hacía lo que yo creía. Tres veces di algo por bueno y al medirlo resultó que no: el latido que pintaba verde mientras el servidor estaba congelado, la prueba de RFC duplicado que pasaba sin índice, y la respuesta que devolvía «_id» donde yo esperaba «id». Las tres las encontré corriendo la aplicación, no leyéndola.</w:t>
+        <w:t xml:space="preserve">Lo que más me costó de este proyecto no fue escribir el código sino comprobar que hacía lo que yo creía. Cuatro veces di algo por bueno y al medirlo resultó que no: el latido que pintaba verde mientras el servidor estaba congelado, la prueba de RFC duplicado que pasaba sin índice, la respuesta que devolvía «_id» donde yo esperaba «id», y un servidor que no arrancaba en cuanto salía de mi terminal. Las cuatro las encontré corriendo la aplicación, no leyéndola.</w:t>
+      </w:r>
+    </w:p>
+    <w:p>
+      <w:pPr>
+        <w:spacing w:after="140" w:line="276"/>
+      </w:pPr>
+      <w:r>
+        <w:rPr>
+          <w:sz w:val="22"/>
+          <w:szCs w:val="22"/>
+        </w:rPr>
+        <w:t xml:space="preserve">De las cuatro, la última es la que más me enseñó. Las otras tres estaban en el código y podía encontrarlas yo solo; esa dependía del entorno de quien lo ejecutara, y mi propia forma de probar era justamente lo que la ocultaba. Un proyecto no está terminado cuando funciona en la máquina donde se escribió.</w:t>
       </w:r>
     </w:p>
     <w:p>

</xml_diff>

<commit_message>
Todo el texto del documento en negro
Los titulos iban en azul y los pies de figura en gris. Ahora la
jerarquia se sostiene solo con el tamano y la negrita.

No basta con el color de cada corrida: Word define sus estilos
Heading1 y Heading2 en azul, y aunque el formato directo gana, el
panel de navegacion y cualquier indice generado seguirian pintandolos
de azul. Por eso se redefinen tambien los estilos.

Co-Authored-By: Claude Opus 5 <noreply@anthropic.com>
</commit_message>
<xml_diff>
--- a/docs/Proyecto Programacion IV - Gestor de Cobranza.docx
+++ b/docs/Proyecto Programacion IV - Gestor de Cobranza.docx
@@ -11,7 +11,7 @@
         <w:rPr>
           <w:b/>
           <w:bCs/>
-          <w:color w:val="2F5496"/>
+          <w:color w:val="000000"/>
           <w:sz w:val="56"/>
           <w:szCs w:val="56"/>
         </w:rPr>
@@ -25,7 +25,7 @@
       </w:pPr>
       <w:r>
         <w:rPr>
-          <w:color w:val="595959"/>
+          <w:color w:val="000000"/>
           <w:sz w:val="28"/>
           <w:szCs w:val="28"/>
         </w:rPr>
@@ -54,7 +54,7 @@
       </w:pPr>
       <w:r>
         <w:rPr>
-          <w:color w:val="595959"/>
+          <w:color w:val="000000"/>
           <w:sz w:val="22"/>
           <w:szCs w:val="22"/>
         </w:rPr>
@@ -108,7 +108,7 @@
       </w:pPr>
       <w:r>
         <w:rPr>
-          <w:color w:val="595959"/>
+          <w:color w:val="000000"/>
           <w:sz w:val="20"/>
           <w:szCs w:val="20"/>
         </w:rPr>
@@ -129,7 +129,7 @@
         <w:rPr>
           <w:b/>
           <w:bCs/>
-          <w:color w:val="2F5496"/>
+          <w:color w:val="000000"/>
           <w:sz w:val="30"/>
           <w:szCs w:val="30"/>
         </w:rPr>
@@ -209,7 +209,7 @@
         <w:rPr>
           <w:b/>
           <w:bCs/>
-          <w:color w:val="2F5496"/>
+          <w:color w:val="000000"/>
           <w:sz w:val="25"/>
           <w:szCs w:val="25"/>
         </w:rPr>
@@ -237,7 +237,7 @@
         <w:rPr>
           <w:b/>
           <w:bCs/>
-          <w:color w:val="2F5496"/>
+          <w:color w:val="000000"/>
           <w:sz w:val="30"/>
           <w:szCs w:val="30"/>
         </w:rPr>
@@ -503,7 +503,7 @@
         <w:rPr>
           <w:b/>
           <w:bCs/>
-          <w:color w:val="2F5496"/>
+          <w:color w:val="000000"/>
           <w:sz w:val="25"/>
           <w:szCs w:val="25"/>
         </w:rPr>
@@ -856,7 +856,7 @@
         <w:rPr>
           <w:b/>
           <w:bCs/>
-          <w:color w:val="2F5496"/>
+          <w:color w:val="000000"/>
           <w:sz w:val="30"/>
           <w:szCs w:val="30"/>
         </w:rPr>
@@ -1032,7 +1032,7 @@
         <w:rPr>
           <w:b/>
           <w:bCs/>
-          <w:color w:val="2F5496"/>
+          <w:color w:val="000000"/>
           <w:sz w:val="25"/>
           <w:szCs w:val="25"/>
         </w:rPr>
@@ -1060,7 +1060,7 @@
         <w:rPr>
           <w:b/>
           <w:bCs/>
-          <w:color w:val="2F5496"/>
+          <w:color w:val="000000"/>
           <w:sz w:val="25"/>
           <w:szCs w:val="25"/>
         </w:rPr>
@@ -1116,7 +1116,7 @@
         <w:rPr>
           <w:b/>
           <w:bCs/>
-          <w:color w:val="2F5496"/>
+          <w:color w:val="000000"/>
           <w:sz w:val="30"/>
           <w:szCs w:val="30"/>
         </w:rPr>
@@ -1285,7 +1285,7 @@
         <w:rPr>
           <w:b/>
           <w:bCs/>
-          <w:color w:val="2F5496"/>
+          <w:color w:val="000000"/>
           <w:sz w:val="25"/>
           <w:szCs w:val="25"/>
         </w:rPr>
@@ -1690,7 +1690,7 @@
         <w:rPr>
           <w:b/>
           <w:bCs/>
-          <w:color w:val="2F5496"/>
+          <w:color w:val="000000"/>
           <w:sz w:val="30"/>
           <w:szCs w:val="30"/>
         </w:rPr>
@@ -1860,7 +1860,7 @@
         <w:rPr>
           <w:b/>
           <w:bCs/>
-          <w:color w:val="2F5496"/>
+          <w:color w:val="000000"/>
           <w:sz w:val="25"/>
           <w:szCs w:val="25"/>
         </w:rPr>
@@ -1939,7 +1939,7 @@
         <w:rPr>
           <w:b/>
           <w:bCs/>
-          <w:color w:val="2F5496"/>
+          <w:color w:val="000000"/>
           <w:sz w:val="25"/>
           <w:szCs w:val="25"/>
         </w:rPr>
@@ -2308,7 +2308,7 @@
         <w:rPr>
           <w:b/>
           <w:bCs/>
-          <w:color w:val="2F5496"/>
+          <w:color w:val="000000"/>
           <w:sz w:val="25"/>
           <w:szCs w:val="25"/>
         </w:rPr>
@@ -2370,7 +2370,7 @@
         <w:rPr>
           <w:i/>
           <w:iCs/>
-          <w:color w:val="595959"/>
+          <w:color w:val="000000"/>
           <w:sz w:val="18"/>
           <w:szCs w:val="18"/>
         </w:rPr>
@@ -2432,7 +2432,7 @@
         <w:rPr>
           <w:i/>
           <w:iCs/>
-          <w:color w:val="595959"/>
+          <w:color w:val="000000"/>
           <w:sz w:val="18"/>
           <w:szCs w:val="18"/>
         </w:rPr>
@@ -2465,7 +2465,7 @@
         <w:rPr>
           <w:b/>
           <w:bCs/>
-          <w:color w:val="2F5496"/>
+          <w:color w:val="000000"/>
           <w:sz w:val="30"/>
           <w:szCs w:val="30"/>
         </w:rPr>
@@ -2597,7 +2597,7 @@
         <w:rPr>
           <w:i/>
           <w:iCs/>
-          <w:color w:val="595959"/>
+          <w:color w:val="000000"/>
           <w:sz w:val="18"/>
           <w:szCs w:val="18"/>
         </w:rPr>
@@ -2613,7 +2613,7 @@
         <w:rPr>
           <w:b/>
           <w:bCs/>
-          <w:color w:val="2F5496"/>
+          <w:color w:val="000000"/>
           <w:sz w:val="30"/>
           <w:szCs w:val="30"/>
         </w:rPr>
@@ -2711,7 +2711,7 @@
         <w:rPr>
           <w:i/>
           <w:iCs/>
-          <w:color w:val="595959"/>
+          <w:color w:val="000000"/>
           <w:sz w:val="18"/>
           <w:szCs w:val="18"/>
         </w:rPr>
@@ -2727,7 +2727,7 @@
         <w:rPr>
           <w:b/>
           <w:bCs/>
-          <w:color w:val="2F5496"/>
+          <w:color w:val="000000"/>
           <w:sz w:val="25"/>
           <w:szCs w:val="25"/>
         </w:rPr>
@@ -2788,7 +2788,7 @@
         <w:rPr>
           <w:b/>
           <w:bCs/>
-          <w:color w:val="2F5496"/>
+          <w:color w:val="000000"/>
           <w:sz w:val="30"/>
           <w:szCs w:val="30"/>
         </w:rPr>
@@ -2945,7 +2945,7 @@
         <w:rPr>
           <w:b/>
           <w:bCs/>
-          <w:color w:val="2F5496"/>
+          <w:color w:val="000000"/>
           <w:sz w:val="25"/>
           <w:szCs w:val="25"/>
         </w:rPr>
@@ -3055,7 +3055,7 @@
         <w:rPr>
           <w:b/>
           <w:bCs/>
-          <w:color w:val="2F5496"/>
+          <w:color w:val="000000"/>
           <w:sz w:val="30"/>
           <w:szCs w:val="30"/>
         </w:rPr>
@@ -3071,7 +3071,7 @@
         <w:rPr>
           <w:b/>
           <w:bCs/>
-          <w:color w:val="2F5496"/>
+          <w:color w:val="000000"/>
           <w:sz w:val="25"/>
           <w:szCs w:val="25"/>
         </w:rPr>
@@ -3347,7 +3347,7 @@
         <w:rPr>
           <w:b/>
           <w:bCs/>
-          <w:color w:val="2F5496"/>
+          <w:color w:val="000000"/>
           <w:sz w:val="25"/>
           <w:szCs w:val="25"/>
         </w:rPr>
@@ -3414,7 +3414,7 @@
         <w:rPr>
           <w:b/>
           <w:bCs/>
-          <w:color w:val="2F5496"/>
+          <w:color w:val="000000"/>
           <w:sz w:val="30"/>
           <w:szCs w:val="30"/>
         </w:rPr>
@@ -3723,9 +3723,7 @@
     <w:next w:val="Normal"/>
     <w:qFormat/>
     <w:rPr>
-      <w:color w:val="2E74B5"/>
-      <w:sz w:val="32"/>
-      <w:szCs w:val="32"/>
+      <w:color w:val="000000"/>
     </w:rPr>
   </w:style>
   <w:style w:type="paragraph" w:styleId="Heading2">
@@ -3734,9 +3732,7 @@
     <w:next w:val="Normal"/>
     <w:qFormat/>
     <w:rPr>
-      <w:color w:val="2E74B5"/>
-      <w:sz w:val="26"/>
-      <w:szCs w:val="26"/>
+      <w:color w:val="000000"/>
     </w:rPr>
   </w:style>
   <w:style w:type="paragraph" w:styleId="Heading3">
@@ -3745,9 +3741,7 @@
     <w:next w:val="Normal"/>
     <w:qFormat/>
     <w:rPr>
-      <w:color w:val="1F4D78"/>
-      <w:sz w:val="24"/>
-      <w:szCs w:val="24"/>
+      <w:color w:val="000000"/>
     </w:rPr>
   </w:style>
   <w:style w:type="paragraph" w:styleId="Heading4">

</xml_diff>